<commit_message>
Se agrega el desarrollo del Caso de uso de consulta de estado de un caso
</commit_message>
<xml_diff>
--- a/Casos de Uso/CU-03-Consulta_de_Estado_del_Caso.docx
+++ b/Casos de Uso/CU-03-Consulta_de_Estado_del_Caso.docx
@@ -1,10 +1,10 @@
 
 <file path=word/document.xml><?xml version="1.0" encoding="utf-8"?>
-<w:document xmlns:wpc="http://schemas.microsoft.com/office/word/2010/wordprocessingCanvas" xmlns:cx="http://schemas.microsoft.com/office/drawing/2014/chartex" xmlns:cx1="http://schemas.microsoft.com/office/drawing/2015/9/8/chartex" xmlns:cx2="http://schemas.microsoft.com/office/drawing/2015/10/21/chartex" xmlns:cx3="http://schemas.microsoft.com/office/drawing/2016/5/9/chartex" xmlns:cx4="http://schemas.microsoft.com/office/drawing/2016/5/10/chartex" xmlns:cx5="http://schemas.microsoft.com/office/drawing/2016/5/11/chartex" xmlns:cx6="http://schemas.microsoft.com/office/drawing/2016/5/12/chartex" xmlns:cx7="http://schemas.microsoft.com/office/drawing/2016/5/13/chartex" xmlns:cx8="http://schemas.microsoft.com/office/drawing/2016/5/14/chartex" xmlns:mc="http://schemas.openxmlformats.org/markup-compatibility/2006" xmlns:aink="http://schemas.microsoft.com/office/drawing/2016/ink" xmlns:am3d="http://schemas.microsoft.com/office/drawing/2017/model3d" xmlns:o="urn:schemas-microsoft-com:office:office" xmlns:oel="http://schemas.microsoft.com/office/2019/extlst" xmlns:r="http://schemas.openxmlformats.org/officeDocument/2006/relationships" xmlns:m="http://schemas.openxmlformats.org/officeDocument/2006/math" xmlns:v="urn:schemas-microsoft-com:vml" xmlns:wp14="http://schemas.microsoft.com/office/word/2010/wordprocessingDrawing" xmlns:wp="http://schemas.openxmlformats.org/drawingml/2006/wordprocessingDrawing" xmlns:w10="urn:schemas-microsoft-com:office:word" xmlns:w="http://schemas.openxmlformats.org/wordprocessingml/2006/main" xmlns:w14="http://schemas.microsoft.com/office/word/2010/wordml" xmlns:w15="http://schemas.microsoft.com/office/word/2012/wordml" xmlns:w16cei="http://schemas.microsoft.com/office/word/2026/wordml/cei" xmlns:w16cex="http://schemas.microsoft.com/office/word/2018/wordml/cex" xmlns:w16cid="http://schemas.microsoft.com/office/word/2016/wordml/cid" xmlns:w16="http://schemas.microsoft.com/office/word/2018/wordml" xmlns:w16du="http://schemas.microsoft.com/office/word/2023/wordml/word16du" xmlns:w16sdtdh="http://schemas.microsoft.com/office/word/2020/wordml/sdtdatahash" xmlns:w16sdtfl="http://schemas.microsoft.com/office/word/2024/wordml/sdtformatlock" xmlns:w16se="http://schemas.microsoft.com/office/word/2015/wordml/symex" xmlns:wpg="http://schemas.microsoft.com/office/word/2010/wordprocessingGroup" xmlns:wpi="http://schemas.microsoft.com/office/word/2010/wordprocessingInk" xmlns:wne="http://schemas.microsoft.com/office/word/2006/wordml" xmlns:wps="http://schemas.microsoft.com/office/word/2010/wordprocessingShape" mc:Ignorable="w14 w15 w16se w16cid w16 w16cex w16sdtdh w16sdtfl w16du wp14">
+<w:document xmlns:wpc="http://schemas.microsoft.com/office/word/2010/wordprocessingCanvas" xmlns:cx="http://schemas.microsoft.com/office/drawing/2014/chartex" xmlns:cx1="http://schemas.microsoft.com/office/drawing/2015/9/8/chartex" xmlns:cx2="http://schemas.microsoft.com/office/drawing/2015/10/21/chartex" xmlns:cx3="http://schemas.microsoft.com/office/drawing/2016/5/9/chartex" xmlns:cx4="http://schemas.microsoft.com/office/drawing/2016/5/10/chartex" xmlns:cx5="http://schemas.microsoft.com/office/drawing/2016/5/11/chartex" xmlns:cx6="http://schemas.microsoft.com/office/drawing/2016/5/12/chartex" xmlns:cx7="http://schemas.microsoft.com/office/drawing/2016/5/13/chartex" xmlns:cx8="http://schemas.microsoft.com/office/drawing/2016/5/14/chartex" xmlns:mc="http://schemas.openxmlformats.org/markup-compatibility/2006" xmlns:aink="http://schemas.microsoft.com/office/drawing/2016/ink" xmlns:am3d="http://schemas.microsoft.com/office/drawing/2017/model3d" xmlns:o="urn:schemas-microsoft-com:office:office" xmlns:r="http://schemas.openxmlformats.org/officeDocument/2006/relationships" xmlns:m="http://schemas.openxmlformats.org/officeDocument/2006/math" xmlns:v="urn:schemas-microsoft-com:vml" xmlns:wp14="http://schemas.microsoft.com/office/word/2010/wordprocessingDrawing" xmlns:wp="http://schemas.openxmlformats.org/drawingml/2006/wordprocessingDrawing" xmlns:w10="urn:schemas-microsoft-com:office:word" xmlns:w="http://schemas.openxmlformats.org/wordprocessingml/2006/main" xmlns:w14="http://schemas.microsoft.com/office/word/2010/wordml" xmlns:w15="http://schemas.microsoft.com/office/word/2012/wordml" xmlns:w16cex="http://schemas.microsoft.com/office/word/2018/wordml/cex" xmlns:w16cid="http://schemas.microsoft.com/office/word/2016/wordml/cid" xmlns:w16="http://schemas.microsoft.com/office/word/2018/wordml" xmlns:w16sdtdh="http://schemas.microsoft.com/office/word/2020/wordml/sdtdatahash" xmlns:w16se="http://schemas.microsoft.com/office/word/2015/wordml/symex" xmlns:wpg="http://schemas.microsoft.com/office/word/2010/wordprocessingGroup" xmlns:wpi="http://schemas.microsoft.com/office/word/2010/wordprocessingInk" xmlns:wne="http://schemas.microsoft.com/office/word/2006/wordml" xmlns:wps="http://schemas.microsoft.com/office/word/2010/wordprocessingShape" mc:Ignorable="w14 w15 w16se w16cid w16 w16cex w16sdtdh wp14">
   <w:body>
     <w:p>
       <w:pPr>
-        <w:pStyle w:val="Ttulo"/>
+        <w:pStyle w:val="Title"/>
         <w:spacing w:before="0" w:after="0"/>
         <w:rPr>
           <w:lang w:val="es-ES"/>
@@ -19,7 +19,7 @@
     </w:p>
     <w:p>
       <w:pPr>
-        <w:pStyle w:val="Ttulo"/>
+        <w:pStyle w:val="Title"/>
         <w:spacing w:before="0" w:after="0"/>
         <w:rPr>
           <w:lang w:val="es-ES"/>
@@ -1297,55 +1297,7 @@
           <w:szCs w:val="20"/>
           <w:lang w:val="es-ES_tradnl"/>
         </w:rPr>
-        <w:t>El sistema muestra el formulario consulta de caso. RN14</w:t>
-      </w:r>
-    </w:p>
-    <w:p>
-      <w:pPr>
-        <w:pStyle w:val="NormalWeb"/>
-        <w:numPr>
-          <w:ilvl w:val="3"/>
-          <w:numId w:val="7"/>
-        </w:numPr>
-        <w:spacing w:line="360" w:lineRule="auto"/>
-        <w:ind w:right="300"/>
-        <w:rPr>
-          <w:sz w:val="20"/>
-          <w:szCs w:val="20"/>
-          <w:lang w:val="es-ES_tradnl"/>
-        </w:rPr>
-      </w:pPr>
-      <w:r>
-        <w:rPr>
-          <w:sz w:val="20"/>
-          <w:szCs w:val="20"/>
-          <w:lang w:val="es-ES_tradnl"/>
-        </w:rPr>
-        <w:t>Se habilita el botón “Buscar”</w:t>
-      </w:r>
-    </w:p>
-    <w:p>
-      <w:pPr>
-        <w:pStyle w:val="NormalWeb"/>
-        <w:numPr>
-          <w:ilvl w:val="3"/>
-          <w:numId w:val="7"/>
-        </w:numPr>
-        <w:spacing w:line="360" w:lineRule="auto"/>
-        <w:ind w:right="300"/>
-        <w:rPr>
-          <w:sz w:val="20"/>
-          <w:szCs w:val="20"/>
-          <w:lang w:val="es-ES_tradnl"/>
-        </w:rPr>
-      </w:pPr>
-      <w:r>
-        <w:rPr>
-          <w:sz w:val="20"/>
-          <w:szCs w:val="20"/>
-          <w:lang w:val="es-ES_tradnl"/>
-        </w:rPr>
-        <w:t>Se habilita el botón “Regresar al portal” FA03</w:t>
+        <w:t>El sistema muestra una ventana con el título “Consultar Estado del caso”</w:t>
       </w:r>
     </w:p>
     <w:p>
@@ -1369,7 +1321,31 @@
           <w:szCs w:val="20"/>
           <w:lang w:val="es-ES_tradnl"/>
         </w:rPr>
-        <w:t>El ciudadano ingresa el código de caso.</w:t>
+        <w:t xml:space="preserve">El sistema muestra el formulario </w:t>
+      </w:r>
+      <w:r>
+        <w:rPr>
+          <w:sz w:val="20"/>
+          <w:szCs w:val="20"/>
+          <w:lang w:val="es-ES_tradnl"/>
+        </w:rPr>
+        <w:t xml:space="preserve">con el campo “Código de seguimiento” para realizar la </w:t>
+      </w:r>
+      <w:r>
+        <w:rPr>
+          <w:sz w:val="20"/>
+          <w:szCs w:val="20"/>
+          <w:lang w:val="es-ES_tradnl"/>
+        </w:rPr>
+        <w:t>consulta de caso. RN1</w:t>
+      </w:r>
+      <w:r>
+        <w:rPr>
+          <w:sz w:val="20"/>
+          <w:szCs w:val="20"/>
+          <w:lang w:val="es-ES_tradnl"/>
+        </w:rPr>
+        <w:t>4</w:t>
       </w:r>
     </w:p>
     <w:p>
@@ -1393,7 +1369,7 @@
           <w:szCs w:val="20"/>
           <w:lang w:val="es-ES_tradnl"/>
         </w:rPr>
-        <w:t>El ciudadano selecciona “Buscar”. FA01</w:t>
+        <w:t>Se muestra el botón “Consultar”</w:t>
       </w:r>
     </w:p>
     <w:p>
@@ -1417,7 +1393,7 @@
           <w:szCs w:val="20"/>
           <w:lang w:val="es-ES_tradnl"/>
         </w:rPr>
-        <w:t>El sistema busca el caso ingresado. FA02</w:t>
+        <w:t>Se muestra el botón “Volver al portal”. FA03</w:t>
       </w:r>
     </w:p>
     <w:p>
@@ -1441,31 +1417,7 @@
           <w:szCs w:val="20"/>
           <w:lang w:val="es-ES_tradnl"/>
         </w:rPr>
-        <w:t>El sistema muestra el formulario respuesta consulta de caso. RN15</w:t>
-      </w:r>
-    </w:p>
-    <w:p>
-      <w:pPr>
-        <w:pStyle w:val="NormalWeb"/>
-        <w:numPr>
-          <w:ilvl w:val="3"/>
-          <w:numId w:val="7"/>
-        </w:numPr>
-        <w:spacing w:line="360" w:lineRule="auto"/>
-        <w:ind w:right="300"/>
-        <w:rPr>
-          <w:sz w:val="20"/>
-          <w:szCs w:val="20"/>
-          <w:lang w:val="es-ES_tradnl"/>
-        </w:rPr>
-      </w:pPr>
-      <w:r>
-        <w:rPr>
-          <w:sz w:val="20"/>
-          <w:szCs w:val="20"/>
-          <w:lang w:val="es-ES_tradnl"/>
-        </w:rPr>
-        <w:t>Se habilita el botón “Regresar al portal”. FA03</w:t>
+        <w:t>El ciudadano ingresa el código de caso.</w:t>
       </w:r>
     </w:p>
     <w:p>
@@ -1489,6 +1441,174 @@
           <w:szCs w:val="20"/>
           <w:lang w:val="es-ES_tradnl"/>
         </w:rPr>
+        <w:t>El ciudadano selecciona “</w:t>
+      </w:r>
+      <w:r>
+        <w:rPr>
+          <w:sz w:val="20"/>
+          <w:szCs w:val="20"/>
+          <w:lang w:val="es-ES_tradnl"/>
+        </w:rPr>
+        <w:t>Consultar</w:t>
+      </w:r>
+      <w:r>
+        <w:rPr>
+          <w:sz w:val="20"/>
+          <w:szCs w:val="20"/>
+          <w:lang w:val="es-ES_tradnl"/>
+        </w:rPr>
+        <w:t>”. FA01</w:t>
+      </w:r>
+    </w:p>
+    <w:p>
+      <w:pPr>
+        <w:pStyle w:val="NormalWeb"/>
+        <w:numPr>
+          <w:ilvl w:val="2"/>
+          <w:numId w:val="7"/>
+        </w:numPr>
+        <w:spacing w:line="360" w:lineRule="auto"/>
+        <w:ind w:right="300"/>
+        <w:rPr>
+          <w:sz w:val="20"/>
+          <w:szCs w:val="20"/>
+          <w:lang w:val="es-ES_tradnl"/>
+        </w:rPr>
+      </w:pPr>
+      <w:r>
+        <w:rPr>
+          <w:sz w:val="20"/>
+          <w:szCs w:val="20"/>
+          <w:lang w:val="es-ES_tradnl"/>
+        </w:rPr>
+        <w:t>El sistema busca el caso ingresado. FA02</w:t>
+      </w:r>
+    </w:p>
+    <w:p>
+      <w:pPr>
+        <w:pStyle w:val="NormalWeb"/>
+        <w:numPr>
+          <w:ilvl w:val="2"/>
+          <w:numId w:val="7"/>
+        </w:numPr>
+        <w:spacing w:line="360" w:lineRule="auto"/>
+        <w:ind w:right="300"/>
+        <w:rPr>
+          <w:sz w:val="20"/>
+          <w:szCs w:val="20"/>
+          <w:lang w:val="es-ES_tradnl"/>
+        </w:rPr>
+      </w:pPr>
+      <w:r>
+        <w:rPr>
+          <w:sz w:val="20"/>
+          <w:szCs w:val="20"/>
+          <w:lang w:val="es-ES_tradnl"/>
+        </w:rPr>
+        <w:t>El sistema muestra el mensaje de éxito. AN01 #14</w:t>
+      </w:r>
+    </w:p>
+    <w:p>
+      <w:pPr>
+        <w:pStyle w:val="NormalWeb"/>
+        <w:numPr>
+          <w:ilvl w:val="2"/>
+          <w:numId w:val="7"/>
+        </w:numPr>
+        <w:spacing w:line="360" w:lineRule="auto"/>
+        <w:ind w:right="300"/>
+        <w:rPr>
+          <w:sz w:val="20"/>
+          <w:szCs w:val="20"/>
+          <w:lang w:val="es-ES_tradnl"/>
+        </w:rPr>
+      </w:pPr>
+      <w:r>
+        <w:rPr>
+          <w:sz w:val="20"/>
+          <w:szCs w:val="20"/>
+          <w:lang w:val="es-ES_tradnl"/>
+        </w:rPr>
+        <w:t xml:space="preserve">El sistema muestra </w:t>
+      </w:r>
+      <w:r>
+        <w:rPr>
+          <w:sz w:val="20"/>
+          <w:szCs w:val="20"/>
+          <w:lang w:val="es-ES_tradnl"/>
+        </w:rPr>
+        <w:t>la información</w:t>
+      </w:r>
+      <w:r>
+        <w:rPr>
+          <w:sz w:val="20"/>
+          <w:szCs w:val="20"/>
+          <w:lang w:val="es-ES_tradnl"/>
+        </w:rPr>
+        <w:t xml:space="preserve"> </w:t>
+      </w:r>
+      <w:r>
+        <w:rPr>
+          <w:sz w:val="20"/>
+          <w:szCs w:val="20"/>
+          <w:lang w:val="es-ES_tradnl"/>
+        </w:rPr>
+        <w:t>correspondiente al caso</w:t>
+      </w:r>
+      <w:r>
+        <w:rPr>
+          <w:sz w:val="20"/>
+          <w:szCs w:val="20"/>
+          <w:lang w:val="es-ES_tradnl"/>
+        </w:rPr>
+        <w:t>. RN15</w:t>
+      </w:r>
+    </w:p>
+    <w:p>
+      <w:pPr>
+        <w:pStyle w:val="NormalWeb"/>
+        <w:numPr>
+          <w:ilvl w:val="2"/>
+          <w:numId w:val="7"/>
+        </w:numPr>
+        <w:spacing w:line="360" w:lineRule="auto"/>
+        <w:ind w:right="300"/>
+        <w:rPr>
+          <w:sz w:val="20"/>
+          <w:szCs w:val="20"/>
+          <w:lang w:val="es-ES_tradnl"/>
+        </w:rPr>
+      </w:pPr>
+      <w:r>
+        <w:rPr>
+          <w:sz w:val="20"/>
+          <w:szCs w:val="20"/>
+          <w:lang w:val="es-ES_tradnl"/>
+        </w:rPr>
+        <w:t>El sistema muestra el botón “Volver al portal” FA03</w:t>
+      </w:r>
+    </w:p>
+    <w:p>
+      <w:pPr>
+        <w:pStyle w:val="NormalWeb"/>
+        <w:numPr>
+          <w:ilvl w:val="2"/>
+          <w:numId w:val="7"/>
+        </w:numPr>
+        <w:spacing w:line="360" w:lineRule="auto"/>
+        <w:ind w:right="300"/>
+        <w:rPr>
+          <w:sz w:val="20"/>
+          <w:szCs w:val="20"/>
+          <w:lang w:val="es-ES_tradnl"/>
+        </w:rPr>
+      </w:pPr>
+      <w:r>
+        <w:rPr>
+          <w:sz w:val="20"/>
+          <w:szCs w:val="20"/>
+          <w:lang w:val="es-ES_tradnl"/>
+        </w:rPr>
         <w:t>Fin del caso de uso.</w:t>
       </w:r>
     </w:p>
@@ -1777,6 +1897,7 @@
           <w:szCs w:val="27"/>
           <w:lang w:val="es-ES_tradnl"/>
         </w:rPr>
+        <w:lastRenderedPageBreak/>
         <w:t>Postcondiciones</w:t>
       </w:r>
     </w:p>
@@ -1821,7 +1942,6 @@
           <w:sz w:val="20"/>
           <w:szCs w:val="20"/>
         </w:rPr>
-        <w:lastRenderedPageBreak/>
         <w:t>No se modifica ningún dato del caso durante la consulta.</w:t>
       </w:r>
     </w:p>
@@ -2190,7 +2310,7 @@
 </file>
 
 <file path=word/endnotes.xml><?xml version="1.0" encoding="utf-8"?>
-<w:endnotes xmlns:wpc="http://schemas.microsoft.com/office/word/2010/wordprocessingCanvas" xmlns:cx="http://schemas.microsoft.com/office/drawing/2014/chartex" xmlns:cx1="http://schemas.microsoft.com/office/drawing/2015/9/8/chartex" xmlns:cx2="http://schemas.microsoft.com/office/drawing/2015/10/21/chartex" xmlns:cx3="http://schemas.microsoft.com/office/drawing/2016/5/9/chartex" xmlns:cx4="http://schemas.microsoft.com/office/drawing/2016/5/10/chartex" xmlns:cx5="http://schemas.microsoft.com/office/drawing/2016/5/11/chartex" xmlns:cx6="http://schemas.microsoft.com/office/drawing/2016/5/12/chartex" xmlns:cx7="http://schemas.microsoft.com/office/drawing/2016/5/13/chartex" xmlns:cx8="http://schemas.microsoft.com/office/drawing/2016/5/14/chartex" xmlns:mc="http://schemas.openxmlformats.org/markup-compatibility/2006" xmlns:aink="http://schemas.microsoft.com/office/drawing/2016/ink" xmlns:am3d="http://schemas.microsoft.com/office/drawing/2017/model3d" xmlns:o="urn:schemas-microsoft-com:office:office" xmlns:oel="http://schemas.microsoft.com/office/2019/extlst" xmlns:r="http://schemas.openxmlformats.org/officeDocument/2006/relationships" xmlns:m="http://schemas.openxmlformats.org/officeDocument/2006/math" xmlns:v="urn:schemas-microsoft-com:vml" xmlns:wp14="http://schemas.microsoft.com/office/word/2010/wordprocessingDrawing" xmlns:wp="http://schemas.openxmlformats.org/drawingml/2006/wordprocessingDrawing" xmlns:w10="urn:schemas-microsoft-com:office:word" xmlns:w="http://schemas.openxmlformats.org/wordprocessingml/2006/main" xmlns:w14="http://schemas.microsoft.com/office/word/2010/wordml" xmlns:w15="http://schemas.microsoft.com/office/word/2012/wordml" xmlns:w16cei="http://schemas.microsoft.com/office/word/2026/wordml/cei" xmlns:w16cex="http://schemas.microsoft.com/office/word/2018/wordml/cex" xmlns:w16cid="http://schemas.microsoft.com/office/word/2016/wordml/cid" xmlns:w16="http://schemas.microsoft.com/office/word/2018/wordml" xmlns:w16du="http://schemas.microsoft.com/office/word/2023/wordml/word16du" xmlns:w16sdtdh="http://schemas.microsoft.com/office/word/2020/wordml/sdtdatahash" xmlns:w16sdtfl="http://schemas.microsoft.com/office/word/2024/wordml/sdtformatlock" xmlns:w16se="http://schemas.microsoft.com/office/word/2015/wordml/symex" xmlns:wpg="http://schemas.microsoft.com/office/word/2010/wordprocessingGroup" xmlns:wpi="http://schemas.microsoft.com/office/word/2010/wordprocessingInk" xmlns:wne="http://schemas.microsoft.com/office/word/2006/wordml" xmlns:wps="http://schemas.microsoft.com/office/word/2010/wordprocessingShape" mc:Ignorable="w14 w15 w16se w16cid w16 w16cex w16sdtdh w16sdtfl w16du wp14">
+<w:endnotes xmlns:wpc="http://schemas.microsoft.com/office/word/2010/wordprocessingCanvas" xmlns:cx="http://schemas.microsoft.com/office/drawing/2014/chartex" xmlns:cx1="http://schemas.microsoft.com/office/drawing/2015/9/8/chartex" xmlns:cx2="http://schemas.microsoft.com/office/drawing/2015/10/21/chartex" xmlns:cx3="http://schemas.microsoft.com/office/drawing/2016/5/9/chartex" xmlns:cx4="http://schemas.microsoft.com/office/drawing/2016/5/10/chartex" xmlns:cx5="http://schemas.microsoft.com/office/drawing/2016/5/11/chartex" xmlns:cx6="http://schemas.microsoft.com/office/drawing/2016/5/12/chartex" xmlns:cx7="http://schemas.microsoft.com/office/drawing/2016/5/13/chartex" xmlns:cx8="http://schemas.microsoft.com/office/drawing/2016/5/14/chartex" xmlns:mc="http://schemas.openxmlformats.org/markup-compatibility/2006" xmlns:aink="http://schemas.microsoft.com/office/drawing/2016/ink" xmlns:am3d="http://schemas.microsoft.com/office/drawing/2017/model3d" xmlns:o="urn:schemas-microsoft-com:office:office" xmlns:r="http://schemas.openxmlformats.org/officeDocument/2006/relationships" xmlns:m="http://schemas.openxmlformats.org/officeDocument/2006/math" xmlns:v="urn:schemas-microsoft-com:vml" xmlns:wp14="http://schemas.microsoft.com/office/word/2010/wordprocessingDrawing" xmlns:wp="http://schemas.openxmlformats.org/drawingml/2006/wordprocessingDrawing" xmlns:w10="urn:schemas-microsoft-com:office:word" xmlns:w="http://schemas.openxmlformats.org/wordprocessingml/2006/main" xmlns:w14="http://schemas.microsoft.com/office/word/2010/wordml" xmlns:w15="http://schemas.microsoft.com/office/word/2012/wordml" xmlns:w16cex="http://schemas.microsoft.com/office/word/2018/wordml/cex" xmlns:w16cid="http://schemas.microsoft.com/office/word/2016/wordml/cid" xmlns:w16="http://schemas.microsoft.com/office/word/2018/wordml" xmlns:w16sdtdh="http://schemas.microsoft.com/office/word/2020/wordml/sdtdatahash" xmlns:w16se="http://schemas.microsoft.com/office/word/2015/wordml/symex" xmlns:wpg="http://schemas.microsoft.com/office/word/2010/wordprocessingGroup" xmlns:wpi="http://schemas.microsoft.com/office/word/2010/wordprocessingInk" xmlns:wne="http://schemas.microsoft.com/office/word/2006/wordml" xmlns:wps="http://schemas.microsoft.com/office/word/2010/wordprocessingShape" mc:Ignorable="w14 w15 w16se w16cid w16 w16cex w16sdtdh wp14">
   <w:endnote w:type="separator" w:id="-1">
     <w:p>
       <w:r>
@@ -2209,7 +2329,7 @@
 </file>
 
 <file path=word/footnotes.xml><?xml version="1.0" encoding="utf-8"?>
-<w:footnotes xmlns:wpc="http://schemas.microsoft.com/office/word/2010/wordprocessingCanvas" xmlns:cx="http://schemas.microsoft.com/office/drawing/2014/chartex" xmlns:cx1="http://schemas.microsoft.com/office/drawing/2015/9/8/chartex" xmlns:cx2="http://schemas.microsoft.com/office/drawing/2015/10/21/chartex" xmlns:cx3="http://schemas.microsoft.com/office/drawing/2016/5/9/chartex" xmlns:cx4="http://schemas.microsoft.com/office/drawing/2016/5/10/chartex" xmlns:cx5="http://schemas.microsoft.com/office/drawing/2016/5/11/chartex" xmlns:cx6="http://schemas.microsoft.com/office/drawing/2016/5/12/chartex" xmlns:cx7="http://schemas.microsoft.com/office/drawing/2016/5/13/chartex" xmlns:cx8="http://schemas.microsoft.com/office/drawing/2016/5/14/chartex" xmlns:mc="http://schemas.openxmlformats.org/markup-compatibility/2006" xmlns:aink="http://schemas.microsoft.com/office/drawing/2016/ink" xmlns:am3d="http://schemas.microsoft.com/office/drawing/2017/model3d" xmlns:o="urn:schemas-microsoft-com:office:office" xmlns:oel="http://schemas.microsoft.com/office/2019/extlst" xmlns:r="http://schemas.openxmlformats.org/officeDocument/2006/relationships" xmlns:m="http://schemas.openxmlformats.org/officeDocument/2006/math" xmlns:v="urn:schemas-microsoft-com:vml" xmlns:wp14="http://schemas.microsoft.com/office/word/2010/wordprocessingDrawing" xmlns:wp="http://schemas.openxmlformats.org/drawingml/2006/wordprocessingDrawing" xmlns:w10="urn:schemas-microsoft-com:office:word" xmlns:w="http://schemas.openxmlformats.org/wordprocessingml/2006/main" xmlns:w14="http://schemas.microsoft.com/office/word/2010/wordml" xmlns:w15="http://schemas.microsoft.com/office/word/2012/wordml" xmlns:w16cei="http://schemas.microsoft.com/office/word/2026/wordml/cei" xmlns:w16cex="http://schemas.microsoft.com/office/word/2018/wordml/cex" xmlns:w16cid="http://schemas.microsoft.com/office/word/2016/wordml/cid" xmlns:w16="http://schemas.microsoft.com/office/word/2018/wordml" xmlns:w16du="http://schemas.microsoft.com/office/word/2023/wordml/word16du" xmlns:w16sdtdh="http://schemas.microsoft.com/office/word/2020/wordml/sdtdatahash" xmlns:w16sdtfl="http://schemas.microsoft.com/office/word/2024/wordml/sdtformatlock" xmlns:w16se="http://schemas.microsoft.com/office/word/2015/wordml/symex" xmlns:wpg="http://schemas.microsoft.com/office/word/2010/wordprocessingGroup" xmlns:wpi="http://schemas.microsoft.com/office/word/2010/wordprocessingInk" xmlns:wne="http://schemas.microsoft.com/office/word/2006/wordml" xmlns:wps="http://schemas.microsoft.com/office/word/2010/wordprocessingShape" mc:Ignorable="w14 w15 w16se w16cid w16 w16cex w16sdtdh w16sdtfl w16du wp14">
+<w:footnotes xmlns:wpc="http://schemas.microsoft.com/office/word/2010/wordprocessingCanvas" xmlns:cx="http://schemas.microsoft.com/office/drawing/2014/chartex" xmlns:cx1="http://schemas.microsoft.com/office/drawing/2015/9/8/chartex" xmlns:cx2="http://schemas.microsoft.com/office/drawing/2015/10/21/chartex" xmlns:cx3="http://schemas.microsoft.com/office/drawing/2016/5/9/chartex" xmlns:cx4="http://schemas.microsoft.com/office/drawing/2016/5/10/chartex" xmlns:cx5="http://schemas.microsoft.com/office/drawing/2016/5/11/chartex" xmlns:cx6="http://schemas.microsoft.com/office/drawing/2016/5/12/chartex" xmlns:cx7="http://schemas.microsoft.com/office/drawing/2016/5/13/chartex" xmlns:cx8="http://schemas.microsoft.com/office/drawing/2016/5/14/chartex" xmlns:mc="http://schemas.openxmlformats.org/markup-compatibility/2006" xmlns:aink="http://schemas.microsoft.com/office/drawing/2016/ink" xmlns:am3d="http://schemas.microsoft.com/office/drawing/2017/model3d" xmlns:o="urn:schemas-microsoft-com:office:office" xmlns:r="http://schemas.openxmlformats.org/officeDocument/2006/relationships" xmlns:m="http://schemas.openxmlformats.org/officeDocument/2006/math" xmlns:v="urn:schemas-microsoft-com:vml" xmlns:wp14="http://schemas.microsoft.com/office/word/2010/wordprocessingDrawing" xmlns:wp="http://schemas.openxmlformats.org/drawingml/2006/wordprocessingDrawing" xmlns:w10="urn:schemas-microsoft-com:office:word" xmlns:w="http://schemas.openxmlformats.org/wordprocessingml/2006/main" xmlns:w14="http://schemas.microsoft.com/office/word/2010/wordml" xmlns:w15="http://schemas.microsoft.com/office/word/2012/wordml" xmlns:w16cex="http://schemas.microsoft.com/office/word/2018/wordml/cex" xmlns:w16cid="http://schemas.microsoft.com/office/word/2016/wordml/cid" xmlns:w16="http://schemas.microsoft.com/office/word/2018/wordml" xmlns:w16sdtdh="http://schemas.microsoft.com/office/word/2020/wordml/sdtdatahash" xmlns:w16se="http://schemas.microsoft.com/office/word/2015/wordml/symex" xmlns:wpg="http://schemas.microsoft.com/office/word/2010/wordprocessingGroup" xmlns:wpi="http://schemas.microsoft.com/office/word/2010/wordprocessingInk" xmlns:wne="http://schemas.microsoft.com/office/word/2006/wordml" xmlns:wps="http://schemas.microsoft.com/office/word/2010/wordprocessingShape" mc:Ignorable="w14 w15 w16se w16cid w16 w16cex w16sdtdh wp14">
   <w:footnote w:type="separator" w:id="-1">
     <w:p>
       <w:r>
@@ -2228,7 +2348,7 @@
 </file>
 
 <file path=word/numbering.xml><?xml version="1.0" encoding="utf-8"?>
-<w:numbering xmlns:wpc="http://schemas.microsoft.com/office/word/2010/wordprocessingCanvas" xmlns:cx="http://schemas.microsoft.com/office/drawing/2014/chartex" xmlns:cx1="http://schemas.microsoft.com/office/drawing/2015/9/8/chartex" xmlns:cx2="http://schemas.microsoft.com/office/drawing/2015/10/21/chartex" xmlns:cx3="http://schemas.microsoft.com/office/drawing/2016/5/9/chartex" xmlns:cx4="http://schemas.microsoft.com/office/drawing/2016/5/10/chartex" xmlns:cx5="http://schemas.microsoft.com/office/drawing/2016/5/11/chartex" xmlns:cx6="http://schemas.microsoft.com/office/drawing/2016/5/12/chartex" xmlns:cx7="http://schemas.microsoft.com/office/drawing/2016/5/13/chartex" xmlns:cx8="http://schemas.microsoft.com/office/drawing/2016/5/14/chartex" xmlns:mc="http://schemas.openxmlformats.org/markup-compatibility/2006" xmlns:aink="http://schemas.microsoft.com/office/drawing/2016/ink" xmlns:am3d="http://schemas.microsoft.com/office/drawing/2017/model3d" xmlns:o="urn:schemas-microsoft-com:office:office" xmlns:oel="http://schemas.microsoft.com/office/2019/extlst" xmlns:r="http://schemas.openxmlformats.org/officeDocument/2006/relationships" xmlns:m="http://schemas.openxmlformats.org/officeDocument/2006/math" xmlns:v="urn:schemas-microsoft-com:vml" xmlns:wp14="http://schemas.microsoft.com/office/word/2010/wordprocessingDrawing" xmlns:wp="http://schemas.openxmlformats.org/drawingml/2006/wordprocessingDrawing" xmlns:w10="urn:schemas-microsoft-com:office:word" xmlns:w="http://schemas.openxmlformats.org/wordprocessingml/2006/main" xmlns:w14="http://schemas.microsoft.com/office/word/2010/wordml" xmlns:w15="http://schemas.microsoft.com/office/word/2012/wordml" xmlns:w16cei="http://schemas.microsoft.com/office/word/2026/wordml/cei" xmlns:w16cex="http://schemas.microsoft.com/office/word/2018/wordml/cex" xmlns:w16cid="http://schemas.microsoft.com/office/word/2016/wordml/cid" xmlns:w16="http://schemas.microsoft.com/office/word/2018/wordml" xmlns:w16du="http://schemas.microsoft.com/office/word/2023/wordml/word16du" xmlns:w16sdtdh="http://schemas.microsoft.com/office/word/2020/wordml/sdtdatahash" xmlns:w16sdtfl="http://schemas.microsoft.com/office/word/2024/wordml/sdtformatlock" xmlns:w16se="http://schemas.microsoft.com/office/word/2015/wordml/symex" xmlns:wpg="http://schemas.microsoft.com/office/word/2010/wordprocessingGroup" xmlns:wpi="http://schemas.microsoft.com/office/word/2010/wordprocessingInk" xmlns:wne="http://schemas.microsoft.com/office/word/2006/wordml" xmlns:wps="http://schemas.microsoft.com/office/word/2010/wordprocessingShape" mc:Ignorable="w14 w15 w16se w16cid w16 w16cex w16sdtdh w16sdtfl w16du wp14">
+<w:numbering xmlns:wpc="http://schemas.microsoft.com/office/word/2010/wordprocessingCanvas" xmlns:cx="http://schemas.microsoft.com/office/drawing/2014/chartex" xmlns:cx1="http://schemas.microsoft.com/office/drawing/2015/9/8/chartex" xmlns:cx2="http://schemas.microsoft.com/office/drawing/2015/10/21/chartex" xmlns:cx3="http://schemas.microsoft.com/office/drawing/2016/5/9/chartex" xmlns:cx4="http://schemas.microsoft.com/office/drawing/2016/5/10/chartex" xmlns:cx5="http://schemas.microsoft.com/office/drawing/2016/5/11/chartex" xmlns:cx6="http://schemas.microsoft.com/office/drawing/2016/5/12/chartex" xmlns:cx7="http://schemas.microsoft.com/office/drawing/2016/5/13/chartex" xmlns:cx8="http://schemas.microsoft.com/office/drawing/2016/5/14/chartex" xmlns:mc="http://schemas.openxmlformats.org/markup-compatibility/2006" xmlns:aink="http://schemas.microsoft.com/office/drawing/2016/ink" xmlns:am3d="http://schemas.microsoft.com/office/drawing/2017/model3d" xmlns:o="urn:schemas-microsoft-com:office:office" xmlns:r="http://schemas.openxmlformats.org/officeDocument/2006/relationships" xmlns:m="http://schemas.openxmlformats.org/officeDocument/2006/math" xmlns:v="urn:schemas-microsoft-com:vml" xmlns:wp14="http://schemas.microsoft.com/office/word/2010/wordprocessingDrawing" xmlns:wp="http://schemas.openxmlformats.org/drawingml/2006/wordprocessingDrawing" xmlns:w10="urn:schemas-microsoft-com:office:word" xmlns:w="http://schemas.openxmlformats.org/wordprocessingml/2006/main" xmlns:w14="http://schemas.microsoft.com/office/word/2010/wordml" xmlns:w15="http://schemas.microsoft.com/office/word/2012/wordml" xmlns:w16cex="http://schemas.microsoft.com/office/word/2018/wordml/cex" xmlns:w16cid="http://schemas.microsoft.com/office/word/2016/wordml/cid" xmlns:w16="http://schemas.microsoft.com/office/word/2018/wordml" xmlns:w16sdtdh="http://schemas.microsoft.com/office/word/2020/wordml/sdtdatahash" xmlns:w16se="http://schemas.microsoft.com/office/word/2015/wordml/symex" xmlns:wpg="http://schemas.microsoft.com/office/word/2010/wordprocessingGroup" xmlns:wpi="http://schemas.microsoft.com/office/word/2010/wordprocessingInk" xmlns:wne="http://schemas.microsoft.com/office/word/2006/wordml" xmlns:wps="http://schemas.microsoft.com/office/word/2010/wordprocessingShape" mc:Ignorable="w14 w15 w16se w16cid w16 w16cex w16sdtdh wp14">
   <w:abstractNum w:abstractNumId="0" w15:restartNumberingAfterBreak="0">
     <w:nsid w:val="02F81A67"/>
     <w:multiLevelType w:val="multilevel"/>
@@ -3551,61 +3671,61 @@
       </w:pPr>
     </w:lvl>
   </w:abstractNum>
-  <w:num w:numId="1" w16cid:durableId="92675463">
+  <w:num w:numId="1">
     <w:abstractNumId w:val="10"/>
   </w:num>
-  <w:num w:numId="2" w16cid:durableId="9646972">
+  <w:num w:numId="2">
     <w:abstractNumId w:val="2"/>
   </w:num>
-  <w:num w:numId="3" w16cid:durableId="1465387613">
+  <w:num w:numId="3">
     <w:abstractNumId w:val="0"/>
   </w:num>
-  <w:num w:numId="4" w16cid:durableId="868878119">
+  <w:num w:numId="4">
     <w:abstractNumId w:val="9"/>
   </w:num>
-  <w:num w:numId="5" w16cid:durableId="317073932">
+  <w:num w:numId="5">
     <w:abstractNumId w:val="6"/>
   </w:num>
-  <w:num w:numId="6" w16cid:durableId="1314991140">
+  <w:num w:numId="6">
     <w:abstractNumId w:val="5"/>
   </w:num>
-  <w:num w:numId="7" w16cid:durableId="1803644919">
+  <w:num w:numId="7">
     <w:abstractNumId w:val="3"/>
   </w:num>
-  <w:num w:numId="8" w16cid:durableId="1836067352">
+  <w:num w:numId="8">
     <w:abstractNumId w:val="4"/>
   </w:num>
-  <w:num w:numId="9" w16cid:durableId="1498303223">
+  <w:num w:numId="9">
     <w:abstractNumId w:val="7"/>
   </w:num>
-  <w:num w:numId="10" w16cid:durableId="370502232">
+  <w:num w:numId="10">
     <w:abstractNumId w:val="14"/>
   </w:num>
-  <w:num w:numId="11" w16cid:durableId="508182967">
+  <w:num w:numId="11">
     <w:abstractNumId w:val="11"/>
   </w:num>
-  <w:num w:numId="12" w16cid:durableId="1583444582">
+  <w:num w:numId="12">
     <w:abstractNumId w:val="1"/>
   </w:num>
-  <w:num w:numId="13" w16cid:durableId="1283806237">
+  <w:num w:numId="13">
     <w:abstractNumId w:val="8"/>
   </w:num>
-  <w:num w:numId="14" w16cid:durableId="2044209653">
+  <w:num w:numId="14">
     <w:abstractNumId w:val="12"/>
   </w:num>
-  <w:num w:numId="15" w16cid:durableId="1336952654">
+  <w:num w:numId="15">
     <w:abstractNumId w:val="13"/>
   </w:num>
 </w:numbering>
 </file>
 
 <file path=word/styles.xml><?xml version="1.0" encoding="utf-8"?>
-<w:styles xmlns:mc="http://schemas.openxmlformats.org/markup-compatibility/2006" xmlns:r="http://schemas.openxmlformats.org/officeDocument/2006/relationships" xmlns:w="http://schemas.openxmlformats.org/wordprocessingml/2006/main" xmlns:w14="http://schemas.microsoft.com/office/word/2010/wordml" xmlns:w15="http://schemas.microsoft.com/office/word/2012/wordml" xmlns:w16cex="http://schemas.microsoft.com/office/word/2018/wordml/cex" xmlns:w16cid="http://schemas.microsoft.com/office/word/2016/wordml/cid" xmlns:w16="http://schemas.microsoft.com/office/word/2018/wordml" xmlns:w16du="http://schemas.microsoft.com/office/word/2023/wordml/word16du" xmlns:w16sdtdh="http://schemas.microsoft.com/office/word/2020/wordml/sdtdatahash" xmlns:w16sdtfl="http://schemas.microsoft.com/office/word/2024/wordml/sdtformatlock" xmlns:w16se="http://schemas.microsoft.com/office/word/2015/wordml/symex" mc:Ignorable="w14 w15 w16se w16cid w16 w16cex w16sdtdh w16sdtfl w16du">
+<w:styles xmlns:mc="http://schemas.openxmlformats.org/markup-compatibility/2006" xmlns:r="http://schemas.openxmlformats.org/officeDocument/2006/relationships" xmlns:w="http://schemas.openxmlformats.org/wordprocessingml/2006/main" xmlns:w14="http://schemas.microsoft.com/office/word/2010/wordml" xmlns:w15="http://schemas.microsoft.com/office/word/2012/wordml" xmlns:w16cex="http://schemas.microsoft.com/office/word/2018/wordml/cex" xmlns:w16cid="http://schemas.microsoft.com/office/word/2016/wordml/cid" xmlns:w16="http://schemas.microsoft.com/office/word/2018/wordml" xmlns:w16sdtdh="http://schemas.microsoft.com/office/word/2020/wordml/sdtdatahash" xmlns:w16se="http://schemas.microsoft.com/office/word/2015/wordml/symex" mc:Ignorable="w14 w15 w16se w16cid w16 w16cex w16sdtdh">
   <w:docDefaults>
     <w:rPrDefault>
       <w:rPr>
         <w:rFonts w:ascii="Times New Roman" w:eastAsia="Times New Roman" w:hAnsi="Times New Roman" w:cs="Times New Roman"/>
-        <w:lang w:val="es-MX" w:eastAsia="es-MX" w:bidi="ar-SA"/>
+        <w:lang w:val="es-419" w:eastAsia="es-419" w:bidi="ar-SA"/>
       </w:rPr>
     </w:rPrDefault>
     <w:pPrDefault/>
@@ -3904,7 +4024,7 @@
       <w:lang w:val="es-ES" w:eastAsia="es-ES"/>
     </w:rPr>
   </w:style>
-  <w:style w:type="paragraph" w:styleId="Ttulo1">
+  <w:style w:type="paragraph" w:styleId="Heading1">
     <w:name w:val="heading 1"/>
     <w:basedOn w:val="Normal"/>
     <w:qFormat/>
@@ -3921,7 +4041,7 @@
       <w:szCs w:val="48"/>
     </w:rPr>
   </w:style>
-  <w:style w:type="paragraph" w:styleId="Ttulo2">
+  <w:style w:type="paragraph" w:styleId="Heading2">
     <w:name w:val="heading 2"/>
     <w:basedOn w:val="Normal"/>
     <w:qFormat/>
@@ -3937,13 +4057,13 @@
       <w:szCs w:val="36"/>
     </w:rPr>
   </w:style>
-  <w:style w:type="character" w:default="1" w:styleId="Fuentedeprrafopredeter">
+  <w:style w:type="character" w:default="1" w:styleId="DefaultParagraphFont">
     <w:name w:val="Default Paragraph Font"/>
     <w:uiPriority w:val="1"/>
     <w:semiHidden/>
     <w:unhideWhenUsed/>
   </w:style>
-  <w:style w:type="table" w:default="1" w:styleId="Tablanormal">
+  <w:style w:type="table" w:default="1" w:styleId="TableNormal">
     <w:name w:val="Normal Table"/>
     <w:uiPriority w:val="99"/>
     <w:semiHidden/>
@@ -3958,7 +4078,7 @@
       </w:tblCellMar>
     </w:tblPr>
   </w:style>
-  <w:style w:type="numbering" w:default="1" w:styleId="Sinlista">
+  <w:style w:type="numbering" w:default="1" w:styleId="NoList">
     <w:name w:val="No List"/>
     <w:uiPriority w:val="99"/>
     <w:semiHidden/>
@@ -3972,7 +4092,7 @@
       <w:spacing w:before="100" w:beforeAutospacing="1" w:after="100" w:afterAutospacing="1"/>
     </w:pPr>
   </w:style>
-  <w:style w:type="paragraph" w:styleId="TDC1">
+  <w:style w:type="paragraph" w:styleId="TOC1">
     <w:name w:val="toc 1"/>
     <w:basedOn w:val="Normal"/>
     <w:rsid w:val="000D097C"/>
@@ -3980,7 +4100,7 @@
       <w:spacing w:before="100" w:beforeAutospacing="1" w:after="100" w:afterAutospacing="1"/>
     </w:pPr>
   </w:style>
-  <w:style w:type="character" w:styleId="Hipervnculo">
+  <w:style w:type="character" w:styleId="Hyperlink">
     <w:name w:val="Hyperlink"/>
     <w:rsid w:val="000D097C"/>
     <w:rPr>
@@ -3988,7 +4108,7 @@
       <w:u w:val="single"/>
     </w:rPr>
   </w:style>
-  <w:style w:type="paragraph" w:styleId="TDC2">
+  <w:style w:type="paragraph" w:styleId="TOC2">
     <w:name w:val="toc 2"/>
     <w:basedOn w:val="Normal"/>
     <w:rsid w:val="000D097C"/>
@@ -3996,7 +4116,7 @@
       <w:spacing w:before="100" w:beforeAutospacing="1" w:after="100" w:afterAutospacing="1"/>
     </w:pPr>
   </w:style>
-  <w:style w:type="paragraph" w:styleId="Sangra3detindependiente">
+  <w:style w:type="paragraph" w:styleId="BodyTextIndent3">
     <w:name w:val="Body Text Indent 3"/>
     <w:basedOn w:val="Normal"/>
     <w:rsid w:val="000D097C"/>
@@ -4004,10 +4124,10 @@
       <w:spacing w:before="100" w:beforeAutospacing="1" w:after="100" w:afterAutospacing="1"/>
     </w:pPr>
   </w:style>
-  <w:style w:type="paragraph" w:styleId="Encabezado">
+  <w:style w:type="paragraph" w:styleId="Header">
     <w:name w:val="header"/>
     <w:basedOn w:val="Normal"/>
-    <w:link w:val="EncabezadoCar"/>
+    <w:link w:val="HeaderChar"/>
     <w:uiPriority w:val="99"/>
     <w:rsid w:val="000D097C"/>
     <w:pPr>
@@ -4024,16 +4144,16 @@
   </w:style>
   <w:style w:type="paragraph" w:customStyle="1" w:styleId="ByLine">
     <w:name w:val="ByLine"/>
-    <w:basedOn w:val="Ttulo"/>
+    <w:basedOn w:val="Title"/>
     <w:rsid w:val="00F6349F"/>
     <w:rPr>
       <w:sz w:val="28"/>
     </w:rPr>
   </w:style>
-  <w:style w:type="paragraph" w:styleId="Ttulo">
+  <w:style w:type="paragraph" w:styleId="Title">
     <w:name w:val="Title"/>
     <w:basedOn w:val="Normal"/>
-    <w:link w:val="TtuloCar"/>
+    <w:link w:val="TitleChar"/>
     <w:qFormat/>
     <w:rsid w:val="00F6349F"/>
     <w:pPr>
@@ -4049,9 +4169,9 @@
       <w:lang w:val="en-US" w:eastAsia="en-US"/>
     </w:rPr>
   </w:style>
-  <w:style w:type="character" w:customStyle="1" w:styleId="TtuloCar">
-    <w:name w:val="Título Car"/>
-    <w:link w:val="Ttulo"/>
+  <w:style w:type="character" w:customStyle="1" w:styleId="TitleChar">
+    <w:name w:val="Title Char"/>
+    <w:link w:val="Title"/>
     <w:rsid w:val="00F6349F"/>
     <w:rPr>
       <w:rFonts w:ascii="Arial" w:hAnsi="Arial"/>
@@ -4078,12 +4198,12 @@
       <w:lang w:val="en-US" w:eastAsia="en-US"/>
     </w:rPr>
   </w:style>
-  <w:style w:type="character" w:styleId="Nmerodelnea">
+  <w:style w:type="character" w:styleId="LineNumber">
     <w:name w:val="line number"/>
-    <w:basedOn w:val="Fuentedeprrafopredeter"/>
+    <w:basedOn w:val="DefaultParagraphFont"/>
     <w:rsid w:val="008F2F81"/>
   </w:style>
-  <w:style w:type="paragraph" w:styleId="Prrafodelista">
+  <w:style w:type="paragraph" w:styleId="ListParagraph">
     <w:name w:val="List Paragraph"/>
     <w:basedOn w:val="Normal"/>
     <w:uiPriority w:val="34"/>
@@ -4093,10 +4213,10 @@
       <w:ind w:left="708"/>
     </w:pPr>
   </w:style>
-  <w:style w:type="paragraph" w:styleId="Piedepgina">
+  <w:style w:type="paragraph" w:styleId="Footer">
     <w:name w:val="footer"/>
     <w:basedOn w:val="Normal"/>
-    <w:link w:val="PiedepginaCar"/>
+    <w:link w:val="FooterChar"/>
     <w:uiPriority w:val="99"/>
     <w:rsid w:val="00344F2B"/>
     <w:pPr>
@@ -4106,9 +4226,9 @@
       </w:tabs>
     </w:pPr>
   </w:style>
-  <w:style w:type="character" w:customStyle="1" w:styleId="PiedepginaCar">
-    <w:name w:val="Pie de página Car"/>
-    <w:link w:val="Piedepgina"/>
+  <w:style w:type="character" w:customStyle="1" w:styleId="FooterChar">
+    <w:name w:val="Footer Char"/>
+    <w:link w:val="Footer"/>
     <w:uiPriority w:val="99"/>
     <w:rsid w:val="00344F2B"/>
     <w:rPr>
@@ -4117,9 +4237,9 @@
       <w:lang w:val="es-ES" w:eastAsia="es-ES"/>
     </w:rPr>
   </w:style>
-  <w:style w:type="character" w:customStyle="1" w:styleId="EncabezadoCar">
-    <w:name w:val="Encabezado Car"/>
-    <w:link w:val="Encabezado"/>
+  <w:style w:type="character" w:customStyle="1" w:styleId="HeaderChar">
+    <w:name w:val="Header Char"/>
+    <w:link w:val="Header"/>
     <w:uiPriority w:val="99"/>
     <w:rsid w:val="00344F2B"/>
     <w:rPr>
@@ -4128,10 +4248,10 @@
       <w:lang w:val="es-ES" w:eastAsia="es-ES"/>
     </w:rPr>
   </w:style>
-  <w:style w:type="paragraph" w:styleId="Textodeglobo">
+  <w:style w:type="paragraph" w:styleId="BalloonText">
     <w:name w:val="Balloon Text"/>
     <w:basedOn w:val="Normal"/>
-    <w:link w:val="TextodegloboCar"/>
+    <w:link w:val="BalloonTextChar"/>
     <w:rsid w:val="00344F2B"/>
     <w:rPr>
       <w:rFonts w:ascii="Tahoma" w:hAnsi="Tahoma" w:cs="Tahoma"/>
@@ -4139,9 +4259,9 @@
       <w:szCs w:val="16"/>
     </w:rPr>
   </w:style>
-  <w:style w:type="character" w:customStyle="1" w:styleId="TextodegloboCar">
-    <w:name w:val="Texto de globo Car"/>
-    <w:link w:val="Textodeglobo"/>
+  <w:style w:type="character" w:customStyle="1" w:styleId="BalloonTextChar">
+    <w:name w:val="Balloon Text Char"/>
+    <w:link w:val="BalloonText"/>
     <w:rsid w:val="00344F2B"/>
     <w:rPr>
       <w:rFonts w:ascii="Tahoma" w:hAnsi="Tahoma" w:cs="Tahoma"/>
@@ -4150,18 +4270,18 @@
       <w:lang w:val="es-ES" w:eastAsia="es-ES"/>
     </w:rPr>
   </w:style>
-  <w:style w:type="paragraph" w:styleId="Textoindependiente">
+  <w:style w:type="paragraph" w:styleId="BodyText">
     <w:name w:val="Body Text"/>
     <w:basedOn w:val="Normal"/>
-    <w:link w:val="TextoindependienteCar"/>
+    <w:link w:val="BodyTextChar"/>
     <w:rsid w:val="00FF438A"/>
     <w:pPr>
       <w:spacing w:after="120"/>
     </w:pPr>
   </w:style>
-  <w:style w:type="character" w:customStyle="1" w:styleId="TextoindependienteCar">
-    <w:name w:val="Texto independiente Car"/>
-    <w:link w:val="Textoindependiente"/>
+  <w:style w:type="character" w:customStyle="1" w:styleId="BodyTextChar">
+    <w:name w:val="Body Text Char"/>
+    <w:link w:val="BodyText"/>
     <w:rsid w:val="00FF438A"/>
     <w:rPr>
       <w:sz w:val="24"/>
@@ -4169,32 +4289,32 @@
       <w:lang w:val="es-ES" w:eastAsia="es-ES"/>
     </w:rPr>
   </w:style>
-  <w:style w:type="paragraph" w:styleId="Textonotaalfinal">
+  <w:style w:type="paragraph" w:styleId="EndnoteText">
     <w:name w:val="endnote text"/>
     <w:basedOn w:val="Normal"/>
-    <w:link w:val="TextonotaalfinalCar"/>
+    <w:link w:val="EndnoteTextChar"/>
     <w:rsid w:val="00A83ADC"/>
     <w:rPr>
       <w:sz w:val="20"/>
       <w:szCs w:val="20"/>
     </w:rPr>
   </w:style>
-  <w:style w:type="character" w:customStyle="1" w:styleId="TextonotaalfinalCar">
-    <w:name w:val="Texto nota al final Car"/>
-    <w:link w:val="Textonotaalfinal"/>
+  <w:style w:type="character" w:customStyle="1" w:styleId="EndnoteTextChar">
+    <w:name w:val="Endnote Text Char"/>
+    <w:link w:val="EndnoteText"/>
     <w:rsid w:val="00A83ADC"/>
     <w:rPr>
       <w:lang w:val="es-ES" w:eastAsia="es-ES"/>
     </w:rPr>
   </w:style>
-  <w:style w:type="character" w:styleId="Refdenotaalfinal">
+  <w:style w:type="character" w:styleId="EndnoteReference">
     <w:name w:val="endnote reference"/>
     <w:rsid w:val="00A83ADC"/>
     <w:rPr>
       <w:vertAlign w:val="superscript"/>
     </w:rPr>
   </w:style>
-  <w:style w:type="paragraph" w:styleId="Revisin">
+  <w:style w:type="paragraph" w:styleId="Revision">
     <w:name w:val="Revision"/>
     <w:hidden/>
     <w:uiPriority w:val="99"/>
@@ -4206,9 +4326,9 @@
       <w:lang w:val="es-ES" w:eastAsia="es-ES"/>
     </w:rPr>
   </w:style>
-  <w:style w:type="table" w:styleId="Tablaconcuadrcula">
+  <w:style w:type="table" w:styleId="TableGrid">
     <w:name w:val="Table Grid"/>
-    <w:basedOn w:val="Tablanormal"/>
+    <w:basedOn w:val="TableNormal"/>
     <w:uiPriority w:val="1"/>
     <w:rsid w:val="00557FB4"/>
     <w:rPr>

</xml_diff>

<commit_message>
Se añade la validación del formato del código de seguimiento en el CU03
</commit_message>
<xml_diff>
--- a/Casos de Uso/CU-03-Consulta_de_Estado_del_Caso.docx
+++ b/Casos de Uso/CU-03-Consulta_de_Estado_del_Caso.docx
@@ -1419,6 +1419,22 @@
         </w:rPr>
         <w:t>El ciudadano ingresa el código de caso.</w:t>
       </w:r>
+      <w:r>
+        <w:rPr>
+          <w:sz w:val="20"/>
+          <w:szCs w:val="20"/>
+          <w:lang w:val="es-ES_tradnl"/>
+        </w:rPr>
+        <w:t xml:space="preserve"> </w:t>
+      </w:r>
+      <w:r>
+        <w:rPr>
+          <w:sz w:val="20"/>
+          <w:szCs w:val="20"/>
+          <w:lang w:val="es-ES_tradnl"/>
+        </w:rPr>
+        <w:t>FA04</w:t>
+      </w:r>
     </w:p>
     <w:p>
       <w:pPr>
@@ -1875,6 +1891,165 @@
     <w:p>
       <w:pPr>
         <w:pStyle w:val="NormalWeb"/>
+        <w:spacing w:before="0" w:beforeAutospacing="0" w:after="0" w:afterAutospacing="0" w:line="360" w:lineRule="auto"/>
+        <w:ind w:left="1068" w:right="301"/>
+        <w:rPr>
+          <w:sz w:val="20"/>
+          <w:szCs w:val="20"/>
+          <w:lang w:val="es-ES_tradnl"/>
+        </w:rPr>
+      </w:pPr>
+    </w:p>
+    <w:p>
+      <w:pPr>
+        <w:pStyle w:val="NormalWeb"/>
+        <w:spacing w:before="0" w:beforeAutospacing="0" w:after="0" w:afterAutospacing="0" w:line="360" w:lineRule="auto"/>
+        <w:ind w:right="301"/>
+        <w:rPr>
+          <w:b/>
+          <w:bCs/>
+          <w:sz w:val="20"/>
+          <w:szCs w:val="20"/>
+          <w:lang w:val="es-ES_tradnl"/>
+        </w:rPr>
+      </w:pPr>
+      <w:r>
+        <w:rPr>
+          <w:sz w:val="20"/>
+          <w:szCs w:val="20"/>
+          <w:lang w:val="es-ES_tradnl"/>
+        </w:rPr>
+        <w:lastRenderedPageBreak/>
+        <w:t xml:space="preserve">     </w:t>
+      </w:r>
+      <w:r>
+        <w:rPr>
+          <w:b/>
+          <w:bCs/>
+          <w:sz w:val="20"/>
+          <w:szCs w:val="20"/>
+          <w:lang w:val="es-ES_tradnl"/>
+        </w:rPr>
+        <w:t>FA0</w:t>
+      </w:r>
+      <w:r>
+        <w:rPr>
+          <w:b/>
+          <w:bCs/>
+          <w:sz w:val="20"/>
+          <w:szCs w:val="20"/>
+          <w:lang w:val="es-ES_tradnl"/>
+        </w:rPr>
+        <w:t>4</w:t>
+      </w:r>
+      <w:r>
+        <w:rPr>
+          <w:b/>
+          <w:bCs/>
+          <w:sz w:val="20"/>
+          <w:szCs w:val="20"/>
+          <w:lang w:val="es-ES_tradnl"/>
+        </w:rPr>
+        <w:t xml:space="preserve"> Código de seguimiento no </w:t>
+      </w:r>
+      <w:r>
+        <w:rPr>
+          <w:b/>
+          <w:bCs/>
+          <w:sz w:val="20"/>
+          <w:szCs w:val="20"/>
+          <w:lang w:val="es-ES_tradnl"/>
+        </w:rPr>
+        <w:t>tiene un formato válido</w:t>
+      </w:r>
+    </w:p>
+    <w:p>
+      <w:pPr>
+        <w:pStyle w:val="NormalWeb"/>
+        <w:numPr>
+          <w:ilvl w:val="0"/>
+          <w:numId w:val="16"/>
+        </w:numPr>
+        <w:spacing w:before="0" w:beforeAutospacing="0" w:after="0" w:afterAutospacing="0" w:line="360" w:lineRule="auto"/>
+        <w:ind w:right="301"/>
+        <w:rPr>
+          <w:sz w:val="20"/>
+          <w:szCs w:val="20"/>
+          <w:lang w:val="es-ES_tradnl"/>
+        </w:rPr>
+      </w:pPr>
+      <w:r>
+        <w:rPr>
+          <w:sz w:val="20"/>
+          <w:szCs w:val="20"/>
+          <w:lang w:val="es-ES_tradnl"/>
+        </w:rPr>
+        <w:t xml:space="preserve">El sistema despliega el mensaje de error. AN02 # </w:t>
+      </w:r>
+      <w:r>
+        <w:rPr>
+          <w:sz w:val="20"/>
+          <w:szCs w:val="20"/>
+          <w:lang w:val="es-ES_tradnl"/>
+        </w:rPr>
+        <w:t>42</w:t>
+      </w:r>
+    </w:p>
+    <w:p>
+      <w:pPr>
+        <w:pStyle w:val="NormalWeb"/>
+        <w:numPr>
+          <w:ilvl w:val="0"/>
+          <w:numId w:val="16"/>
+        </w:numPr>
+        <w:spacing w:before="0" w:beforeAutospacing="0" w:after="0" w:afterAutospacing="0" w:line="360" w:lineRule="auto"/>
+        <w:ind w:right="301"/>
+        <w:rPr>
+          <w:sz w:val="20"/>
+          <w:szCs w:val="20"/>
+          <w:lang w:val="es-ES_tradnl"/>
+        </w:rPr>
+      </w:pPr>
+      <w:r>
+        <w:rPr>
+          <w:sz w:val="20"/>
+          <w:szCs w:val="20"/>
+          <w:lang w:val="es-ES_tradnl"/>
+        </w:rPr>
+        <w:t>El sistema retorna al paso 2.3.</w:t>
+      </w:r>
+      <w:r>
+        <w:rPr>
+          <w:sz w:val="20"/>
+          <w:szCs w:val="20"/>
+          <w:lang w:val="es-ES_tradnl"/>
+        </w:rPr>
+        <w:t>3</w:t>
+      </w:r>
+      <w:r>
+        <w:rPr>
+          <w:sz w:val="20"/>
+          <w:szCs w:val="20"/>
+          <w:lang w:val="es-ES_tradnl"/>
+        </w:rPr>
+        <w:t>.</w:t>
+      </w:r>
+    </w:p>
+    <w:p>
+      <w:pPr>
+        <w:pStyle w:val="NormalWeb"/>
+        <w:spacing w:before="0" w:beforeAutospacing="0" w:after="0" w:afterAutospacing="0" w:line="360" w:lineRule="auto"/>
+        <w:ind w:right="301"/>
+        <w:rPr>
+          <w:sz w:val="20"/>
+          <w:szCs w:val="20"/>
+          <w:lang w:val="es-ES_tradnl"/>
+        </w:rPr>
+      </w:pPr>
+    </w:p>
+    <w:p>
+      <w:pPr>
+        <w:pStyle w:val="NormalWeb"/>
         <w:numPr>
           <w:ilvl w:val="1"/>
           <w:numId w:val="7"/>
@@ -1897,7 +2072,6 @@
           <w:szCs w:val="27"/>
           <w:lang w:val="es-ES_tradnl"/>
         </w:rPr>
-        <w:lastRenderedPageBreak/>
         <w:t>Postcondiciones</w:t>
       </w:r>
     </w:p>
@@ -3494,6 +3668,95 @@
     </w:lvl>
   </w:abstractNum>
   <w:abstractNum w:abstractNumId="13" w15:restartNumberingAfterBreak="0">
+    <w:nsid w:val="757B3DE1"/>
+    <w:multiLevelType w:val="hybridMultilevel"/>
+    <w:tmpl w:val="97AAC656"/>
+    <w:lvl w:ilvl="0" w:tplc="AF4A1518">
+      <w:start w:val="1"/>
+      <w:numFmt w:val="decimal"/>
+      <w:lvlText w:val="%1."/>
+      <w:lvlJc w:val="left"/>
+      <w:pPr>
+        <w:ind w:left="1068" w:hanging="360"/>
+      </w:pPr>
+      <w:rPr>
+        <w:rFonts w:hint="default"/>
+      </w:rPr>
+    </w:lvl>
+    <w:lvl w:ilvl="1" w:tplc="080A0019" w:tentative="1">
+      <w:start w:val="1"/>
+      <w:numFmt w:val="lowerLetter"/>
+      <w:lvlText w:val="%2."/>
+      <w:lvlJc w:val="left"/>
+      <w:pPr>
+        <w:ind w:left="1788" w:hanging="360"/>
+      </w:pPr>
+    </w:lvl>
+    <w:lvl w:ilvl="2" w:tplc="080A001B" w:tentative="1">
+      <w:start w:val="1"/>
+      <w:numFmt w:val="lowerRoman"/>
+      <w:lvlText w:val="%3."/>
+      <w:lvlJc w:val="right"/>
+      <w:pPr>
+        <w:ind w:left="2508" w:hanging="180"/>
+      </w:pPr>
+    </w:lvl>
+    <w:lvl w:ilvl="3" w:tplc="080A000F" w:tentative="1">
+      <w:start w:val="1"/>
+      <w:numFmt w:val="decimal"/>
+      <w:lvlText w:val="%4."/>
+      <w:lvlJc w:val="left"/>
+      <w:pPr>
+        <w:ind w:left="3228" w:hanging="360"/>
+      </w:pPr>
+    </w:lvl>
+    <w:lvl w:ilvl="4" w:tplc="080A0019" w:tentative="1">
+      <w:start w:val="1"/>
+      <w:numFmt w:val="lowerLetter"/>
+      <w:lvlText w:val="%5."/>
+      <w:lvlJc w:val="left"/>
+      <w:pPr>
+        <w:ind w:left="3948" w:hanging="360"/>
+      </w:pPr>
+    </w:lvl>
+    <w:lvl w:ilvl="5" w:tplc="080A001B" w:tentative="1">
+      <w:start w:val="1"/>
+      <w:numFmt w:val="lowerRoman"/>
+      <w:lvlText w:val="%6."/>
+      <w:lvlJc w:val="right"/>
+      <w:pPr>
+        <w:ind w:left="4668" w:hanging="180"/>
+      </w:pPr>
+    </w:lvl>
+    <w:lvl w:ilvl="6" w:tplc="080A000F" w:tentative="1">
+      <w:start w:val="1"/>
+      <w:numFmt w:val="decimal"/>
+      <w:lvlText w:val="%7."/>
+      <w:lvlJc w:val="left"/>
+      <w:pPr>
+        <w:ind w:left="5388" w:hanging="360"/>
+      </w:pPr>
+    </w:lvl>
+    <w:lvl w:ilvl="7" w:tplc="080A0019" w:tentative="1">
+      <w:start w:val="1"/>
+      <w:numFmt w:val="lowerLetter"/>
+      <w:lvlText w:val="%8."/>
+      <w:lvlJc w:val="left"/>
+      <w:pPr>
+        <w:ind w:left="6108" w:hanging="360"/>
+      </w:pPr>
+    </w:lvl>
+    <w:lvl w:ilvl="8" w:tplc="080A001B" w:tentative="1">
+      <w:start w:val="1"/>
+      <w:numFmt w:val="lowerRoman"/>
+      <w:lvlText w:val="%9."/>
+      <w:lvlJc w:val="right"/>
+      <w:pPr>
+        <w:ind w:left="6828" w:hanging="180"/>
+      </w:pPr>
+    </w:lvl>
+  </w:abstractNum>
+  <w:abstractNum w:abstractNumId="14" w15:restartNumberingAfterBreak="0">
     <w:nsid w:val="77F5392A"/>
     <w:multiLevelType w:val="hybridMultilevel"/>
     <w:tmpl w:val="6E72A7EA"/>
@@ -3582,7 +3845,7 @@
       </w:pPr>
     </w:lvl>
   </w:abstractNum>
-  <w:abstractNum w:abstractNumId="14" w15:restartNumberingAfterBreak="0">
+  <w:abstractNum w:abstractNumId="15" w15:restartNumberingAfterBreak="0">
     <w:nsid w:val="7A492679"/>
     <w:multiLevelType w:val="hybridMultilevel"/>
     <w:tmpl w:val="45E6E7B8"/>
@@ -3699,7 +3962,7 @@
     <w:abstractNumId w:val="7"/>
   </w:num>
   <w:num w:numId="10">
-    <w:abstractNumId w:val="14"/>
+    <w:abstractNumId w:val="15"/>
   </w:num>
   <w:num w:numId="11">
     <w:abstractNumId w:val="11"/>
@@ -3714,6 +3977,9 @@
     <w:abstractNumId w:val="12"/>
   </w:num>
   <w:num w:numId="15">
+    <w:abstractNumId w:val="14"/>
+  </w:num>
+  <w:num w:numId="16">
     <w:abstractNumId w:val="13"/>
   </w:num>
 </w:numbering>

</xml_diff>